<commit_message>
updated site and essay
</commit_message>
<xml_diff>
--- a/public/AI_In_Schools_Essay.docx
+++ b/public/AI_In_Schools_Essay.docx
@@ -45,7 +45,7 @@
           <w:sz w:val="22"/>
           <w:szCs w:val="22"/>
         </w:rPr>
-        <w:t xml:space="preserve">Taylor | Rutgers University | Spring 2026</w:t>
+        <w:t xml:space="preserve">Taylor Houghtaling | College Writing | Rutgers University | Spring 2026</w:t>
       </w:r>
     </w:p>
     <w:p>
@@ -144,20 +144,20 @@
           <w:sz w:val="24"/>
           <w:szCs w:val="24"/>
         </w:rPr>
-        <w:t xml:space="preserve">One of the clearest arguments for teaching AI in schools is simply that the professional world has already adopted it. According to McKinsey &amp; Company's 2023 State of AI survey of 1,684 participants, one-third of all organizations are already regularly using generative AI in at least one business function — and 40 percent of those organizations plan to increase their AI investment further because of it. Students who graduate without experience using AI tools are entering a job market where AI literacy is increasingly expected, not optional. Writing, in particular, is one of the domains most transformed — marketers, developers, lawyers, and engineers are all using AI to draft, refine, and structure written work. Teaching students to do this well — critically, responsibly, with verification — is as practical as teaching them to use spreadsheets or presentation software.</w:t>
-      </w:r>
-    </w:p>
-    <w:p>
-      <w:pPr>
-        <w:spacing w:after="240" w:line="480"/>
-      </w:pPr>
-      <w:r>
-        <w:rPr>
-          <w:rFonts w:ascii="Times New Roman" w:cs="Times New Roman" w:eastAsia="Times New Roman" w:hAnsi="Times New Roman"/>
-          <w:sz w:val="24"/>
-          <w:szCs w:val="24"/>
-        </w:rPr>
-        <w:t xml:space="preserve">The argument that AI "does the work for students" misunderstands what professional AI use actually looks like. A professional does not simply paste a prompt and submit the output. They evaluate it, edit it, fact-check it, and revise it to match their voice and their audience. Teaching students to do exactly that is teaching writing — just at a higher, more iterative level.</w:t>
+        <w:t xml:space="preserve">One of the clearest arguments for teaching AI in schools is simply that the professional world has already adopted it — and the pace of that adoption is accelerating in ways that make the debate feel almost overdue. According to McKinsey &amp; Company's 2023 State of AI survey, one-third of all organizations were already regularly using generative AI in at least one business function, with 40 percent of those organizations planning to increase AI investment further. Just two years later, the picture had shifted dramatically. A Wharton and GBK Collective report from 2025 found that 92 percent of companies now plan to increase their AI investment over the next three years — more than double the 2023 figure. And by February 2026, a Gallup survey of 23,717 U.S. employees found that 41 percent now say their organization has integrated AI tools into its practices, with 65 percent of employees in AI-adopting organizations reporting that AI improved their productivity and efficiency (Gallup, 2026).</w:t>
+      </w:r>
+    </w:p>
+    <w:p>
+      <w:pPr>
+        <w:spacing w:after="240" w:line="480"/>
+      </w:pPr>
+      <w:r>
+        <w:rPr>
+          <w:rFonts w:ascii="Times New Roman" w:cs="Times New Roman" w:eastAsia="Times New Roman" w:hAnsi="Times New Roman"/>
+          <w:sz w:val="24"/>
+          <w:szCs w:val="24"/>
+        </w:rPr>
+        <w:t xml:space="preserve">That trajectory — from one-third of organizations experimenting in 2023, to nearly all companies committing further investment by 2025, to measurable productivity gains confirmed in 2026 — is not a slow drift. It is a structural shift in how work gets done. A Morgan Stanley survey of 935 corporate executives found an average net productivity gain of 11.5 percent among companies most exposed to AI adoption (Morgan Stanley, 2026). Students who graduate without experience using AI tools are entering a labor market that has already made its decision. Teaching students to use AI well — critically, responsibly, with verification — is as practical as teaching them to use spreadsheets or presentation software.</w:t>
       </w:r>
     </w:p>
     <w:p>
@@ -198,7 +198,7 @@
           <w:sz w:val="24"/>
           <w:szCs w:val="24"/>
         </w:rPr>
-        <w:t xml:space="preserve">There is also a significant equity argument. Not every student has a parent who is a skilled writer, access to private tutors, or the confidence to visit office hours. AI writing tools democratize access to feedback that was previously only available to students with those resources. A first-generation college student who has never been taught how to structure a thesis argument can use AI as a patient, available, always-on guide — not to cheat, but to learn.</w:t>
+        <w:t xml:space="preserve">There is also a significant equity argument. Not every student has a parent who is a skilled writer, access to private tutors, or the confidence to visit office hours. AI writing tools democratize access to feedback that was previously only available to students with those resources. UNESCO's 2023 global guidance on generative AI in education explicitly calls on institutions to support students in using GenAI 'effectively, ethically, and transparently' rather than seeking to prohibit its use (Miao and Holmes, 2023).</w:t>
       </w:r>
     </w:p>
     <w:p>
@@ -213,33 +213,33 @@
           <w:sz w:val="28"/>
           <w:szCs w:val="28"/>
         </w:rPr>
-        <w:t xml:space="preserve">Banning AI Doesn't Work — Teaching It Does</w:t>
-      </w:r>
-    </w:p>
-    <w:p>
-      <w:pPr>
-        <w:spacing w:after="240" w:line="480"/>
-      </w:pPr>
-      <w:r>
-        <w:rPr>
-          <w:rFonts w:ascii="Times New Roman" w:cs="Times New Roman" w:eastAsia="Times New Roman" w:hAnsi="Times New Roman"/>
-          <w:sz w:val="24"/>
-          <w:szCs w:val="24"/>
-        </w:rPr>
-        <w:t xml:space="preserve">Some schools have responded to the rise of AI by banning its use and deploying AI-detection software. This approach has serious problems. Research published in Education Week found that AI detection tools are unreliable, with particularly high false-positive rates for English learners — a Stanford University study found that over half of TOEFL essays written by non-native speakers were incorrectly flagged as AI-generated, while native-speaker essays passed (Najarro, 2023). Falsely accusing a student of cheating can have lasting consequences on their academic record and relationship with their institution.</w:t>
-      </w:r>
-    </w:p>
-    <w:p>
-      <w:pPr>
-        <w:spacing w:after="240" w:line="480"/>
-      </w:pPr>
-      <w:r>
-        <w:rPr>
-          <w:rFonts w:ascii="Times New Roman" w:cs="Times New Roman" w:eastAsia="Times New Roman" w:hAnsi="Times New Roman"/>
-          <w:sz w:val="24"/>
-          <w:szCs w:val="24"/>
-        </w:rPr>
-        <w:t xml:space="preserve">The more effective approach is what researchers and educators call AI-integrated pedagogy — explicitly teaching students when, how, and why to use AI tools, and building assignments that require demonstrated human thought even when AI assistance is permitted. As Roose argued in The New York Times, banning ChatGPT is not going to work; students have phones and other means of access regardless of school policy. Teaching AI literacy also opens up conversations about its limitations — hallucinated facts, biased outputs, stylistic flatness — which are critical thinking exercises in their own right.</w:t>
+        <w:t xml:space="preserve">The Numbers Have Only Grown</w:t>
+      </w:r>
+    </w:p>
+    <w:p>
+      <w:pPr>
+        <w:spacing w:after="240" w:line="480"/>
+      </w:pPr>
+      <w:r>
+        <w:rPr>
+          <w:rFonts w:ascii="Times New Roman" w:cs="Times New Roman" w:eastAsia="Times New Roman" w:hAnsi="Times New Roman"/>
+          <w:sz w:val="24"/>
+          <w:szCs w:val="24"/>
+        </w:rPr>
+        <w:t xml:space="preserve">What makes the case for teaching AI in schools especially urgent is not just where the numbers stand today, but how fast they have moved. In 2023, McKinsey found that 40 percent of AI-adopting organizations planned to increase their investment because of generative AI. By 2025, Wharton's research showed that figure had more than doubled to 92 percent. In 2023, one-third of organizations were regularly using gen AI in at least one function. By early 2026, Gallup's national survey of nearly 24,000 workers showed 41 percent of employees reporting organization-wide AI integration — and among those workers, 65 percent said AI had improved their productivity. Morgan Stanley's 2026 survey confirmed the output: companies in AI-exposed sectors reported an average 11.5 percent net productivity gain.</w:t>
+      </w:r>
+    </w:p>
+    <w:p>
+      <w:pPr>
+        <w:spacing w:after="240" w:line="480"/>
+      </w:pPr>
+      <w:r>
+        <w:rPr>
+          <w:rFonts w:ascii="Times New Roman" w:cs="Times New Roman" w:eastAsia="Times New Roman" w:hAnsi="Times New Roman"/>
+          <w:sz w:val="24"/>
+          <w:szCs w:val="24"/>
+        </w:rPr>
+        <w:t xml:space="preserve">This rate of change has a direct implication for education. A student who enrolled in college in 2023 is entering the workforce in 2027 — a labor market that, by every available measure, will be more AI-saturated than the one we can observe today. If schools begin teaching AI literacy now, those students will graduate with real, practiced skills. If schools continue to ban or ignore AI, those students will graduate into a world where their employers will be the ones teaching them — inefficiently, on the job, without the critical frameworks that an education can provide. The window to act is not closing slowly. It is closing quickly.</w:t>
       </w:r>
     </w:p>
     <w:p>
@@ -254,20 +254,46 @@
           <w:sz w:val="28"/>
           <w:szCs w:val="28"/>
         </w:rPr>
-        <w:t xml:space="preserve">Conclusion</w:t>
-      </w:r>
-    </w:p>
-    <w:p>
-      <w:pPr>
-        <w:spacing w:after="240" w:line="480"/>
-      </w:pPr>
-      <w:r>
-        <w:rPr>
-          <w:rFonts w:ascii="Times New Roman" w:cs="Times New Roman" w:eastAsia="Times New Roman" w:hAnsi="Times New Roman"/>
-          <w:sz w:val="24"/>
-          <w:szCs w:val="24"/>
-        </w:rPr>
-        <w:t xml:space="preserve">The question "should AI be allowed in schools?" is already being answered by students themselves, every day. The better question — the more honest one — is whether schools will be part of teaching students to use it well. AI writing tools, used thoughtfully and taught explicitly, are not a threat to education. They are an extension of the same impulse that gave us dictionaries, grammar guides, peer review, and writing centers: the recognition that good writing is a craft that benefits from tools, feedback, and iteration. Schools that teach students to navigate AI critically and ethically are not lowering standards. They are raising them to meet the world their students are actually entering.</w:t>
+        <w:t xml:space="preserve">Banning AI Doesn't Work — Teaching It Does</w:t>
+      </w:r>
+    </w:p>
+    <w:p>
+      <w:pPr>
+        <w:spacing w:after="240" w:line="480"/>
+      </w:pPr>
+      <w:r>
+        <w:rPr>
+          <w:rFonts w:ascii="Times New Roman" w:cs="Times New Roman" w:eastAsia="Times New Roman" w:hAnsi="Times New Roman"/>
+          <w:sz w:val="24"/>
+          <w:szCs w:val="24"/>
+        </w:rPr>
+        <w:t xml:space="preserve">Some schools have responded to the rise of AI by banning its use and deploying AI-detection software. This approach has serious problems rooted in science, not opinion. A 2024 peer-reviewed study published in the International Journal of Educational Technology in Higher Education tested six major AI detectors against 805 samples. The study found that simple manipulation techniques reduced detector accuracy by 17.4 percent — leading its authors to conclude that these tools 'cannot currently be recommended for determining academic integrity violations due to accuracy limitations and the potential for false accusation which undermines inclusive and fair assessment practices' (Perkins et al., 2024). A separate Stanford-backed study found that over half of TOEFL essays written by non-native English speakers were incorrectly flagged as AI-generated by detection tools (Najarro, 2023).</w:t>
+      </w:r>
+    </w:p>
+    <w:p>
+      <w:pPr>
+        <w:spacing w:after="240" w:line="480"/>
+      </w:pPr>
+      <w:r>
+        <w:rPr>
+          <w:rFonts w:ascii="Times New Roman" w:cs="Times New Roman" w:eastAsia="Times New Roman" w:hAnsi="Times New Roman"/>
+          <w:sz w:val="24"/>
+          <w:szCs w:val="24"/>
+        </w:rPr>
+        <w:t xml:space="preserve">Even Rutgers University's own institutional guidance acknowledges these realities. The Rutgers University Libraries AI in Teaching guide (updated January 2026) notes that AI detectors 'can be prone to produce false positives or negatives' and 'tend to be biased against non-native English writers.' Rutgers' official AI guidance from the Office of Information Technology (updated 2025) takes a measured, instructor-driven stance — explicitly noting that 'guidance on the appropriate use of AI tools in academic settings will typically vary depending on the discipline, course, and/or instructor.' This is not a ban. It is an acknowledgment that context matters.</w:t>
+      </w:r>
+    </w:p>
+    <w:p>
+      <w:pPr>
+        <w:spacing w:after="240" w:line="480"/>
+      </w:pPr>
+      <w:r>
+        <w:rPr>
+          <w:rFonts w:ascii="Times New Roman" w:cs="Times New Roman" w:eastAsia="Times New Roman" w:hAnsi="Times New Roman"/>
+          <w:sz w:val="24"/>
+          <w:szCs w:val="24"/>
+        </w:rPr>
+        <w:t xml:space="preserve">As New York Times technology columnist Kevin Roose argued in January 2023, banning ChatGPT simply will not work: students have phones, personal laptops, and VPNs. The more effective approach is AI-integrated pedagogy — explicitly teaching students when, how, and why to use AI tools, and designing assignments that require demonstrated human thought even when AI assistance is permitted. A student who learns to critically evaluate an AI-generated paragraph is practicing exactly the kind of source skepticism that research and writing classes have always aimed to build.</w:t>
       </w:r>
     </w:p>
     <w:p>
@@ -282,83 +308,25 @@
           <w:sz w:val="28"/>
           <w:szCs w:val="28"/>
         </w:rPr>
-        <w:t xml:space="preserve">Works Cited</w:t>
-      </w:r>
-    </w:p>
-    <w:p>
-      <w:pPr>
-        <w:spacing w:after="180" w:line="480"/>
-        <w:ind w:left="720" w:hanging="720"/>
-      </w:pPr>
-      <w:r>
-        <w:rPr>
-          <w:rFonts w:ascii="Times New Roman" w:cs="Times New Roman" w:eastAsia="Times New Roman" w:hAnsi="Times New Roman"/>
-          <w:sz w:val="24"/>
-          <w:szCs w:val="24"/>
-        </w:rPr>
-        <w:t xml:space="preserve">Mollick, Ethan R. and Lilach Mollick. "Assigning AI: Seven Approaches for Students, with Prompts." SSRN, 23 Sept. 2023. https://doi.org/10.2139/ssrn.4475995.</w:t>
-      </w:r>
-    </w:p>
-    <w:p>
-      <w:pPr>
-        <w:spacing w:after="180" w:line="480"/>
-        <w:ind w:left="720" w:hanging="720"/>
-      </w:pPr>
-      <w:r>
-        <w:rPr>
-          <w:rFonts w:ascii="Times New Roman" w:cs="Times New Roman" w:eastAsia="Times New Roman" w:hAnsi="Times New Roman"/>
-          <w:sz w:val="24"/>
-          <w:szCs w:val="24"/>
-        </w:rPr>
-        <w:t xml:space="preserve">McKinsey &amp; Company. "The State of AI in 2023: Generative AI's Breakout Year." McKinsey Global Institute, 2023. https://www.mckinsey.com/capabilities/quantumblack/our-insights/the-state-of-ai-in-2023-generative-ais-breakout-year.</w:t>
-      </w:r>
-    </w:p>
-    <w:p>
-      <w:pPr>
-        <w:spacing w:after="180" w:line="480"/>
-        <w:ind w:left="720" w:hanging="720"/>
-      </w:pPr>
-      <w:r>
-        <w:rPr>
-          <w:rFonts w:ascii="Times New Roman" w:cs="Times New Roman" w:eastAsia="Times New Roman" w:hAnsi="Times New Roman"/>
-          <w:sz w:val="24"/>
-          <w:szCs w:val="24"/>
-        </w:rPr>
-        <w:t xml:space="preserve">Miao, Fengchun, and Wayne Holmes. "Guidance for Generative AI in Education and Research." UNESCO, 7 Sept. 2023. https://www.unesco.org/en/articles/guidance-generative-ai-education-and-research.</w:t>
-      </w:r>
-    </w:p>
-    <w:p>
-      <w:pPr>
-        <w:spacing w:after="180" w:line="480"/>
-        <w:ind w:left="720" w:hanging="720"/>
-      </w:pPr>
-      <w:r>
-        <w:rPr>
-          <w:rFonts w:ascii="Times New Roman" w:cs="Times New Roman" w:eastAsia="Times New Roman" w:hAnsi="Times New Roman"/>
-          <w:sz w:val="24"/>
-          <w:szCs w:val="24"/>
-        </w:rPr>
-        <w:t xml:space="preserve">Najarro, Ileana. "Another AI Issue for Schools to Know About: Bias Against Non-Native English Speakers." Education Week, 23 Aug. 2023. https://www.edweek.org/technology/another-ai-issue-for-schools-to-know-about-bias-against-non-native-english-speakers/2023/08.</w:t>
-      </w:r>
-    </w:p>
-    <w:p>
-      <w:pPr>
-        <w:spacing w:after="180" w:line="480"/>
-        <w:ind w:left="720" w:hanging="720"/>
-      </w:pPr>
-      <w:r>
-        <w:rPr>
-          <w:rFonts w:ascii="Times New Roman" w:cs="Times New Roman" w:eastAsia="Times New Roman" w:hAnsi="Times New Roman"/>
-          <w:sz w:val="24"/>
-          <w:szCs w:val="24"/>
-        </w:rPr>
-        <w:t xml:space="preserve">Roose, Kevin. "Don't Ban ChatGPT in Schools. Teach With It." The New York Times, 12 Jan. 2023. https://www.nytimes.com/2023/01/12/technology/chatgpt-schools-teachers.html.</w:t>
+        <w:t xml:space="preserve">Conclusion</w:t>
+      </w:r>
+    </w:p>
+    <w:p>
+      <w:pPr>
+        <w:spacing w:after="240" w:line="480"/>
+      </w:pPr>
+      <w:r>
+        <w:rPr>
+          <w:rFonts w:ascii="Times New Roman" w:cs="Times New Roman" w:eastAsia="Times New Roman" w:hAnsi="Times New Roman"/>
+          <w:sz w:val="24"/>
+          <w:szCs w:val="24"/>
+        </w:rPr>
+        <w:t xml:space="preserve">The question 'should AI be allowed in schools?' is already being answered by students themselves, every day. The better question — the more honest one — is whether schools will be part of teaching students to use it well. In 2023, 40 percent of AI-adopting companies planned to increase their investment. By 2025, that figure had risen to 92 percent. The trajectory of this technology is not uncertain — it is already written in the data. Schools that teach students to navigate AI critically and ethically are not lowering standards. They are raising them to meet the world their students are actually entering.</w:t>
       </w:r>
     </w:p>
     <w:p>
       <w:pPr>
         <w:pStyle w:val="Heading1"/>
-        <w:pageBreakBefore/>
       </w:pPr>
       <w:r>
         <w:rPr>
@@ -368,6 +336,162 @@
           <w:sz w:val="28"/>
           <w:szCs w:val="28"/>
         </w:rPr>
+        <w:t xml:space="preserve">Works Cited</w:t>
+      </w:r>
+    </w:p>
+    <w:p>
+      <w:pPr>
+        <w:spacing w:after="180" w:line="480"/>
+        <w:ind w:left="720" w:hanging="720"/>
+      </w:pPr>
+      <w:r>
+        <w:rPr>
+          <w:rFonts w:ascii="Times New Roman" w:cs="Times New Roman" w:eastAsia="Times New Roman" w:hAnsi="Times New Roman"/>
+          <w:sz w:val="24"/>
+          <w:szCs w:val="24"/>
+        </w:rPr>
+        <w:t xml:space="preserve">Mollick, Ethan R. and Lilach Mollick. "Assigning AI: Seven Approaches for Students, with Prompts." SSRN, 23 Sept. 2023. https://doi.org/10.2139/ssrn.4475995.</w:t>
+      </w:r>
+    </w:p>
+    <w:p>
+      <w:pPr>
+        <w:spacing w:after="180" w:line="480"/>
+        <w:ind w:left="720" w:hanging="720"/>
+      </w:pPr>
+      <w:r>
+        <w:rPr>
+          <w:rFonts w:ascii="Times New Roman" w:cs="Times New Roman" w:eastAsia="Times New Roman" w:hAnsi="Times New Roman"/>
+          <w:sz w:val="24"/>
+          <w:szCs w:val="24"/>
+        </w:rPr>
+        <w:t xml:space="preserve">Miao, Fengchun, and Wayne Holmes. "Guidance for Generative AI in Education and Research." UNESCO, 7 Sept. 2023. https://www.unesco.org/en/articles/guidance-generative-ai-education-and-research.</w:t>
+      </w:r>
+    </w:p>
+    <w:p>
+      <w:pPr>
+        <w:spacing w:after="180" w:line="480"/>
+        <w:ind w:left="720" w:hanging="720"/>
+      </w:pPr>
+      <w:r>
+        <w:rPr>
+          <w:rFonts w:ascii="Times New Roman" w:cs="Times New Roman" w:eastAsia="Times New Roman" w:hAnsi="Times New Roman"/>
+          <w:sz w:val="24"/>
+          <w:szCs w:val="24"/>
+        </w:rPr>
+        <w:t xml:space="preserve">Perkins, Mike, Jasper Roe, Binh H. Vu, Darius Postma, Don Hickerson, James McGaughran, and Huy Q. Khuat. "Simple Techniques to Bypass GenAI Text Detectors: Implications for Inclusive Education." International Journal of Educational Technology in Higher Education, vol. 21, 2024, article 53. https://link.springer.com/article/10.1186/s41239-024-00487-w.</w:t>
+      </w:r>
+    </w:p>
+    <w:p>
+      <w:pPr>
+        <w:spacing w:after="180" w:line="480"/>
+        <w:ind w:left="720" w:hanging="720"/>
+      </w:pPr>
+      <w:r>
+        <w:rPr>
+          <w:rFonts w:ascii="Times New Roman" w:cs="Times New Roman" w:eastAsia="Times New Roman" w:hAnsi="Times New Roman"/>
+          <w:sz w:val="24"/>
+          <w:szCs w:val="24"/>
+        </w:rPr>
+        <w:t xml:space="preserve">Najarro, Ileana. "Another AI Issue for Schools to Know About: Bias Against Non-Native English Speakers." Education Week, 23 Aug. 2023. https://www.edweek.org/technology/another-ai-issue-for-schools-to-know-about-bias-against-non-native-english-speakers/2023/08.</w:t>
+      </w:r>
+    </w:p>
+    <w:p>
+      <w:pPr>
+        <w:spacing w:after="180" w:line="480"/>
+        <w:ind w:left="720" w:hanging="720"/>
+      </w:pPr>
+      <w:r>
+        <w:rPr>
+          <w:rFonts w:ascii="Times New Roman" w:cs="Times New Roman" w:eastAsia="Times New Roman" w:hAnsi="Times New Roman"/>
+          <w:sz w:val="24"/>
+          <w:szCs w:val="24"/>
+        </w:rPr>
+        <w:t xml:space="preserve">Roose, Kevin. "Don't Ban ChatGPT in Schools. Teach With It." The New York Times, 12 Jan. 2023. https://www.nytimes.com/2023/01/12/technology/chatgpt-schools-teachers.html.</w:t>
+      </w:r>
+    </w:p>
+    <w:p>
+      <w:pPr>
+        <w:spacing w:after="180" w:line="480"/>
+        <w:ind w:left="720" w:hanging="720"/>
+      </w:pPr>
+      <w:r>
+        <w:rPr>
+          <w:rFonts w:ascii="Times New Roman" w:cs="Times New Roman" w:eastAsia="Times New Roman" w:hAnsi="Times New Roman"/>
+          <w:sz w:val="24"/>
+          <w:szCs w:val="24"/>
+        </w:rPr>
+        <w:t xml:space="preserve">Rutgers University Office of Information Technology. "Guidance on the Use of AI at Rutgers." Rutgers University, updated 2025. https://it.rutgers.edu/ai/guidance-on-the-use-of-ai-at-rutgers/.</w:t>
+      </w:r>
+    </w:p>
+    <w:p>
+      <w:pPr>
+        <w:spacing w:after="180" w:line="480"/>
+        <w:ind w:left="720" w:hanging="720"/>
+      </w:pPr>
+      <w:r>
+        <w:rPr>
+          <w:rFonts w:ascii="Times New Roman" w:cs="Times New Roman" w:eastAsia="Times New Roman" w:hAnsi="Times New Roman"/>
+          <w:sz w:val="24"/>
+          <w:szCs w:val="24"/>
+        </w:rPr>
+        <w:t xml:space="preserve">Rutgers University Libraries. "AI in Teaching." Rutgers University Research Guides, updated Jan. 2026. https://libguides.rutgers.edu/artificial-intelligence/ai-in-teaching.</w:t>
+      </w:r>
+    </w:p>
+    <w:p>
+      <w:pPr>
+        <w:spacing w:after="180" w:line="480"/>
+        <w:ind w:left="720" w:hanging="720"/>
+      </w:pPr>
+      <w:r>
+        <w:rPr>
+          <w:rFonts w:ascii="Times New Roman" w:cs="Times New Roman" w:eastAsia="Times New Roman" w:hAnsi="Times New Roman"/>
+          <w:sz w:val="24"/>
+          <w:szCs w:val="24"/>
+        </w:rPr>
+        <w:t xml:space="preserve">Gallup. "Rising AI Adoption Spurs Workforce Changes." Gallup Workplace, Feb. 2026. (n=23,717 U.S. employees) https://www.gallup.com/workplace/704225/rising-adoption-spurs-workforce-changes.aspx.</w:t>
+      </w:r>
+    </w:p>
+    <w:p>
+      <w:pPr>
+        <w:spacing w:after="180" w:line="480"/>
+        <w:ind w:left="720" w:hanging="720"/>
+      </w:pPr>
+      <w:r>
+        <w:rPr>
+          <w:rFonts w:ascii="Times New Roman" w:cs="Times New Roman" w:eastAsia="Times New Roman" w:hAnsi="Times New Roman"/>
+          <w:sz w:val="24"/>
+          <w:szCs w:val="24"/>
+        </w:rPr>
+        <w:t xml:space="preserve">Morgan Stanley Research. "AI Adoption Accelerates: Survey Findings." Morgan Stanley Insights, 2026. (n=935 executives, 5 sectors) https://www.morganstanley.com/insights/articles/ai-adoption-accelerates-survey-find.</w:t>
+      </w:r>
+    </w:p>
+    <w:p>
+      <w:pPr>
+        <w:spacing w:after="180" w:line="480"/>
+        <w:ind w:left="720" w:hanging="720"/>
+      </w:pPr>
+      <w:r>
+        <w:rPr>
+          <w:rFonts w:ascii="Times New Roman" w:cs="Times New Roman" w:eastAsia="Times New Roman" w:hAnsi="Times New Roman"/>
+          <w:sz w:val="24"/>
+          <w:szCs w:val="24"/>
+        </w:rPr>
+        <w:t xml:space="preserve">Korst, Jeremy, Stefano Puntoni, and Prasanna Tambe. "2025 AI Adoption Report: Gen AI Fast-Tracks Into the Enterprise." Knowledge at Wharton / GBK Collective, Oct. 2025. https://knowledge.wharton.upenn.edu/special-report/2025-ai-adoption-report/.</w:t>
+      </w:r>
+    </w:p>
+    <w:p>
+      <w:pPr>
+        <w:pStyle w:val="Heading1"/>
+        <w:pageBreakBefore/>
+      </w:pPr>
+      <w:r>
+        <w:rPr>
+          <w:rFonts w:ascii="Times New Roman" w:cs="Times New Roman" w:eastAsia="Times New Roman" w:hAnsi="Times New Roman"/>
+          <w:b/>
+          <w:bCs/>
+          <w:sz w:val="28"/>
+          <w:szCs w:val="28"/>
+        </w:rPr>
         <w:t xml:space="preserve">Reflection</w:t>
       </w:r>
     </w:p>
@@ -394,20 +518,20 @@
           <w:sz w:val="24"/>
           <w:szCs w:val="24"/>
         </w:rPr>
-        <w:t xml:space="preserve">For my multimodal composition, I utilized three primary modes of communication: Linguistic, Visual, and Spatial. The linguistic mode forms the backbone of the composition — the written argument itself, organized around a clear thesis and supported by expert sources. I chose this mode because my central claim is argumentative and required sustained prose reasoning to develop effectively.</w:t>
-      </w:r>
-    </w:p>
-    <w:p>
-      <w:pPr>
-        <w:spacing w:after="240" w:line="480"/>
-      </w:pPr>
-      <w:r>
-        <w:rPr>
-          <w:rFonts w:ascii="Times New Roman" w:cs="Times New Roman" w:eastAsia="Times New Roman" w:hAnsi="Times New Roman"/>
-          <w:sz w:val="24"/>
-          <w:szCs w:val="24"/>
-        </w:rPr>
-        <w:t xml:space="preserve">The visual mode was incorporated through the companion website I created as part of this project. The site uses comparative infographics, visual section headers, and a designed layout to communicate the structure and stakes of the argument at a glance. I chose the visual mode because my audience — other students and educators — is accustomed to processing information digitally, and visual design can communicate tone and urgency in ways that pure text cannot.</w:t>
+        <w:t xml:space="preserve">For my multimodal composition, I utilized three primary modes of communication: Linguistic, Visual, and Spatial. The linguistic mode forms the backbone — the written argument itself, organized around a clear thesis and supported by expert sources including peer-reviewed studies, Gallup and Morgan Stanley workforce data, and Rutgers' own institutional AI guidance. I chose this mode because my central claim is argumentative and required sustained prose reasoning to develop effectively.</w:t>
+      </w:r>
+    </w:p>
+    <w:p>
+      <w:pPr>
+        <w:spacing w:after="240" w:line="480"/>
+      </w:pPr>
+      <w:r>
+        <w:rPr>
+          <w:rFonts w:ascii="Times New Roman" w:cs="Times New Roman" w:eastAsia="Times New Roman" w:hAnsi="Times New Roman"/>
+          <w:sz w:val="24"/>
+          <w:szCs w:val="24"/>
+        </w:rPr>
+        <w:t xml:space="preserve">The visual mode was incorporated through the companion website I created as part of this project. The site uses comparative infographics, a growth-over-time data table showing how AI adoption figures have shifted from 2023 to 2026, visual section headers, and a designed layout to communicate the structure and stakes of the argument at a glance. I chose the visual mode because my audience — other students and educators — is accustomed to processing information digitally, and visual design can communicate tone and urgency in ways that pure text cannot.</w:t>
       </w:r>
     </w:p>
     <w:p>
@@ -433,7 +557,7 @@
           <w:sz w:val="24"/>
           <w:szCs w:val="24"/>
         </w:rPr>
-        <w:t xml:space="preserve">The most challenging part of this project was resisting the urge to oversimplify. The question of AI in schools is genuinely complex — there are real risks of dependency, academic dishonesty, and inequitable access. I tried to address these honestly rather than dismissing them, because a strong argument engages with counterarguments rather than avoiding them. Ultimately, I hope this project demonstrates that the question is not whether AI belongs in education, but how we ensure it belongs there on our terms.</w:t>
+        <w:t xml:space="preserve">The most challenging part of this project was resisting the urge to oversimplify. The question of AI in schools is genuinely complex — there are real risks of dependency, academic dishonesty, and inequitable access. I tried to address these honestly, including by engaging directly with Rutgers' own policy and with peer-reviewed research on AI detector failures. Ultimately, I hope this project demonstrates that the question is not whether AI belongs in education, but how we ensure it belongs there on our terms — and with urgency, because the numbers tell us the window to act is narrowing.</w:t>
       </w:r>
     </w:p>
     <w:sectPr>

</xml_diff>

<commit_message>
updated contact section with CTA for essay
</commit_message>
<xml_diff>
--- a/public/AI_In_Schools_Essay.docx
+++ b/public/AI_In_Schools_Essay.docx
@@ -88,7 +88,7 @@
           <w:sz w:val="24"/>
           <w:szCs w:val="24"/>
         </w:rPr>
-        <w:t xml:space="preserve">AI should not just be permitted in schools — it should be taught as a literacy skill, particularly for writing, because learning to work with AI effectively prepares students for the real world while actually strengthening their thinking, not replacing it.</w:t>
+        <w:t xml:space="preserve">My argument is that AI should not just be permitted in schools — it should be taught, specifically as a literacy skill, with particular attention to writing. Students who learn to work with AI critically and deliberately will be better prepared for the world they are entering. Those who don't will still use it. The difference is that the second group won't know what they're doing.</w:t>
       </w:r>
     </w:p>
     <w:p>
@@ -116,7 +116,20 @@
           <w:sz w:val="24"/>
           <w:szCs w:val="24"/>
         </w:rPr>
-        <w:t xml:space="preserve">Every generation of students has faced a version of the same debate: is the new tool a shortcut, or a skill? When calculators entered math classrooms, teachers worried students would stop learning arithmetic. When the internet became ubiquitous, critics warned it would make research lazy. In both cases, the answer was not to ban the tool but to teach students how to use it well. Artificial intelligence, and specifically AI writing assistants like ChatGPT, Claude, and others, presents the same moment of choice. The question is not whether AI should exist in schools — it already does, whether schools acknowledge it or not. The real question is: should schools teach students how to use it? The answer is yes.</w:t>
+        <w:t xml:space="preserve">I want to be upfront about something: I use AI tools regularly. Not to finish my homework faster, but as part of building real software at a startup I co-founded called Tenzor LLC. When I'm working on a component — say, a checkout flow for a gym's point-of-sale system — I might ask an AI to help me think through how to structure the state, or to surface an approach I hadn't considered. Then I evaluate it, often reject parts of it, rewrite it to match our codebase, and ship something that's genuinely mine. That process is not cheating. That is how people work in 2026.</w:t>
+      </w:r>
+    </w:p>
+    <w:p>
+      <w:pPr>
+        <w:spacing w:after="240" w:line="480"/>
+      </w:pPr>
+      <w:r>
+        <w:rPr>
+          <w:rFonts w:ascii="Times New Roman" w:cs="Times New Roman" w:eastAsia="Times New Roman" w:hAnsi="Times New Roman"/>
+          <w:sz w:val="24"/>
+          <w:szCs w:val="24"/>
+        </w:rPr>
+        <w:t xml:space="preserve">So when I hear the argument that AI should be banned from schools because students will use it to do their work for them, I think about how badly that misunderstands what good AI use actually looks like. The question is not whether students will use AI — they already are. The real question is whether their teachers are going to be part of that conversation or not.</w:t>
       </w:r>
     </w:p>
     <w:p>
@@ -144,20 +157,20 @@
           <w:sz w:val="24"/>
           <w:szCs w:val="24"/>
         </w:rPr>
-        <w:t xml:space="preserve">One of the clearest arguments for teaching AI in schools is simply that the professional world has already adopted it — and the pace of that adoption is accelerating in ways that make the debate feel almost overdue. According to McKinsey &amp; Company's 2023 State of AI survey, one-third of all organizations were already regularly using generative AI in at least one business function, with 40 percent of those organizations planning to increase AI investment further. Just two years later, the picture had shifted dramatically. A Wharton and GBK Collective report from 2025 found that 92 percent of companies now plan to increase their AI investment over the next three years — more than double the 2023 figure. And by February 2026, a Gallup survey of 23,717 U.S. employees found that 41 percent now say their organization has integrated AI tools into its practices, with 65 percent of employees in AI-adopting organizations reporting that AI improved their productivity and efficiency (Gallup, 2026).</w:t>
-      </w:r>
-    </w:p>
-    <w:p>
-      <w:pPr>
-        <w:spacing w:after="240" w:line="480"/>
-      </w:pPr>
-      <w:r>
-        <w:rPr>
-          <w:rFonts w:ascii="Times New Roman" w:cs="Times New Roman" w:eastAsia="Times New Roman" w:hAnsi="Times New Roman"/>
-          <w:sz w:val="24"/>
-          <w:szCs w:val="24"/>
-        </w:rPr>
-        <w:t xml:space="preserve">That trajectory — from one-third of organizations experimenting in 2023, to nearly all companies committing further investment by 2025, to measurable productivity gains confirmed in 2026 — is not a slow drift. It is a structural shift in how work gets done. A Morgan Stanley survey of 935 corporate executives found an average net productivity gain of 11.5 percent among companies most exposed to AI adoption (Morgan Stanley, 2026). Students who graduate without experience using AI tools are entering a labor market that has already made its decision. Teaching students to use AI well — critically, responsibly, with verification — is as practical as teaching them to use spreadsheets or presentation software.</w:t>
+        <w:t xml:space="preserve">The numbers on AI adoption are not just large — they are moving fast in one direction. In 2023, McKinsey found that one-third of organizations were already regularly using generative AI in at least one business function, and 40 percent of those organizations planned to increase AI investment. Two years later, Wharton's research showed 92 percent of companies planned to increase that investment — more than double (Korst et al., 2025). By February 2026, Gallup's national survey of nearly 24,000 employees found 41 percent reporting that their organization had integrated AI tools, with 65 percent of those workers saying AI had improved their productivity (Gallup, 2026). Morgan Stanley found an average 11.5 percent net productivity gain across the sectors most exposed to AI adoption (Morgan Stanley, 2026).</w:t>
+      </w:r>
+    </w:p>
+    <w:p>
+      <w:pPr>
+        <w:spacing w:after="240" w:line="480"/>
+      </w:pPr>
+      <w:r>
+        <w:rPr>
+          <w:rFonts w:ascii="Times New Roman" w:cs="Times New Roman" w:eastAsia="Times New Roman" w:hAnsi="Times New Roman"/>
+          <w:sz w:val="24"/>
+          <w:szCs w:val="24"/>
+        </w:rPr>
+        <w:t xml:space="preserve">That trajectory matters for students. A first-year enrolling today graduates in 2029 into a labor market shaped by those numbers. If schools wait for the conversation to feel more settled before addressing AI in classrooms, they will have spent four years producing graduates who are behind on day one. Teaching students to use AI well — critically, responsibly, with an eye toward verification and revision — is not lowering the bar. It is updating what the bar actually requires.</w:t>
       </w:r>
     </w:p>
     <w:p>
@@ -172,33 +185,46 @@
           <w:sz w:val="28"/>
           <w:szCs w:val="28"/>
         </w:rPr>
-        <w:t xml:space="preserve">AI as a Writing Tool Builds Skills, Not Dependency</w:t>
-      </w:r>
-    </w:p>
-    <w:p>
-      <w:pPr>
-        <w:spacing w:after="240" w:line="480"/>
-      </w:pPr>
-      <w:r>
-        <w:rPr>
-          <w:rFonts w:ascii="Times New Roman" w:cs="Times New Roman" w:eastAsia="Times New Roman" w:hAnsi="Times New Roman"/>
-          <w:sz w:val="24"/>
-          <w:szCs w:val="24"/>
-        </w:rPr>
-        <w:t xml:space="preserve">A common fear is that using AI to help write essays will make students worse writers. The research suggests the opposite when AI is used as a process tool rather than a product generator. In their 2023 SSRN paper, Ethan Mollick and Lilach Mollick of the Wharton School propose frameworks for AI as a tutor, coach, and feedback tool — all roles that scaffold student thinking rather than replace it. Students who use AI as a drafting scaffold — generating outlines, getting feedback on organization, or exploring multiple phrasings — can direct more cognitive energy toward argumentation and clarity, consistent with decades of research on scaffolded writing instruction.</w:t>
-      </w:r>
-    </w:p>
-    <w:p>
-      <w:pPr>
-        <w:spacing w:after="240" w:line="480"/>
-      </w:pPr>
-      <w:r>
-        <w:rPr>
-          <w:rFonts w:ascii="Times New Roman" w:cs="Times New Roman" w:eastAsia="Times New Roman" w:hAnsi="Times New Roman"/>
-          <w:sz w:val="24"/>
-          <w:szCs w:val="24"/>
-        </w:rPr>
-        <w:t xml:space="preserve">There is also a significant equity argument. Not every student has a parent who is a skilled writer, access to private tutors, or the confidence to visit office hours. AI writing tools democratize access to feedback that was previously only available to students with those resources. UNESCO's 2023 global guidance on generative AI in education explicitly calls on institutions to support students in using GenAI 'effectively, ethically, and transparently' rather than seeking to prohibit its use (Miao and Holmes, 2023).</w:t>
+        <w:t xml:space="preserve">AI as a Writing Tool Builds Skills, Not Dependency — But the Risk Is Real</w:t>
+      </w:r>
+    </w:p>
+    <w:p>
+      <w:pPr>
+        <w:spacing w:after="240" w:line="480"/>
+      </w:pPr>
+      <w:r>
+        <w:rPr>
+          <w:rFonts w:ascii="Times New Roman" w:cs="Times New Roman" w:eastAsia="Times New Roman" w:hAnsi="Times New Roman"/>
+          <w:sz w:val="24"/>
+          <w:szCs w:val="24"/>
+        </w:rPr>
+        <w:t xml:space="preserve">I want to be honest about the counterargument here because I think it is worth taking seriously. There is a real version of the concern that AI makes students worse writers. If a student opens ChatGPT, pastes in a prompt, and submits the output, they have not learned anything. They have not wrestled with their ideas, they have not figured out what they actually think, and they have not practiced the kind of slow, difficult reasoning that writing is supposed to build. That version of AI use is genuinely bad for learning — and it happens.</w:t>
+      </w:r>
+    </w:p>
+    <w:p>
+      <w:pPr>
+        <w:spacing w:after="240" w:line="480"/>
+      </w:pPr>
+      <w:r>
+        <w:rPr>
+          <w:rFonts w:ascii="Times New Roman" w:cs="Times New Roman" w:eastAsia="Times New Roman" w:hAnsi="Times New Roman"/>
+          <w:sz w:val="24"/>
+          <w:szCs w:val="24"/>
+        </w:rPr>
+        <w:t xml:space="preserve">But that is a pedagogy problem, not an AI problem. Mollick and Mollick's 2023 research at the Wharton School argues that the difference between AI as a crutch and AI as a scaffold comes down entirely to how it is introduced. Their framework positions AI as a tutor, a coach, a feedback tool — something that pushes students to think harder, not something that thinks for them (Mollick and Mollick, 2023). A student who uses AI to generate a rough outline, then argues with that outline and rewrites it, has done more cognitive work than a student who stares at a blank page and gives up. The question is not whether to allow AI, but how to structure assignments so that AI use requires thinking.</w:t>
+      </w:r>
+    </w:p>
+    <w:p>
+      <w:pPr>
+        <w:spacing w:after="240" w:line="480"/>
+      </w:pPr>
+      <w:r>
+        <w:rPr>
+          <w:rFonts w:ascii="Times New Roman" w:cs="Times New Roman" w:eastAsia="Times New Roman" w:hAnsi="Times New Roman"/>
+          <w:sz w:val="24"/>
+          <w:szCs w:val="24"/>
+        </w:rPr>
+        <w:t xml:space="preserve">There is also a real equity dimension to this. Students who come from families where academic writing is modeled at home, who have access to tutors, who feel comfortable in office hours — they have always had an advantage. AI, used thoughtfully, starts to close that gap. UNESCO's 2023 guidance on generative AI in education makes exactly this point, calling on institutions to support students in using these tools 'effectively, ethically, and transparently' rather than prohibiting access that would only disadvantage those who need it most (Miao and Holmes, 2023).</w:t>
       </w:r>
     </w:p>
     <w:p>
@@ -213,33 +239,33 @@
           <w:sz w:val="28"/>
           <w:szCs w:val="28"/>
         </w:rPr>
-        <w:t xml:space="preserve">The Numbers Have Only Grown</w:t>
-      </w:r>
-    </w:p>
-    <w:p>
-      <w:pPr>
-        <w:spacing w:after="240" w:line="480"/>
-      </w:pPr>
-      <w:r>
-        <w:rPr>
-          <w:rFonts w:ascii="Times New Roman" w:cs="Times New Roman" w:eastAsia="Times New Roman" w:hAnsi="Times New Roman"/>
-          <w:sz w:val="24"/>
-          <w:szCs w:val="24"/>
-        </w:rPr>
-        <w:t xml:space="preserve">What makes the case for teaching AI in schools especially urgent is not just where the numbers stand today, but how fast they have moved. In 2023, McKinsey found that 40 percent of AI-adopting organizations planned to increase their investment because of generative AI. By 2025, Wharton's research showed that figure had more than doubled to 92 percent. In 2023, one-third of organizations were regularly using gen AI in at least one function. By early 2026, Gallup's national survey of nearly 24,000 workers showed 41 percent of employees reporting organization-wide AI integration — and among those workers, 65 percent said AI had improved their productivity. Morgan Stanley's 2026 survey confirmed the output: companies in AI-exposed sectors reported an average 11.5 percent net productivity gain.</w:t>
-      </w:r>
-    </w:p>
-    <w:p>
-      <w:pPr>
-        <w:spacing w:after="240" w:line="480"/>
-      </w:pPr>
-      <w:r>
-        <w:rPr>
-          <w:rFonts w:ascii="Times New Roman" w:cs="Times New Roman" w:eastAsia="Times New Roman" w:hAnsi="Times New Roman"/>
-          <w:sz w:val="24"/>
-          <w:szCs w:val="24"/>
-        </w:rPr>
-        <w:t xml:space="preserve">This rate of change has a direct implication for education. A student who enrolled in college in 2023 is entering the workforce in 2027 — a labor market that, by every available measure, will be more AI-saturated than the one we can observe today. If schools begin teaching AI literacy now, those students will graduate with real, practiced skills. If schools continue to ban or ignore AI, those students will graduate into a world where their employers will be the ones teaching them — inefficiently, on the job, without the critical frameworks that an education can provide. The window to act is not closing slowly. It is closing quickly.</w:t>
+        <w:t xml:space="preserve">The Numbers Have Only Grown — and the Window Is Narrowing</w:t>
+      </w:r>
+    </w:p>
+    <w:p>
+      <w:pPr>
+        <w:spacing w:after="240" w:line="480"/>
+      </w:pPr>
+      <w:r>
+        <w:rPr>
+          <w:rFonts w:ascii="Times New Roman" w:cs="Times New Roman" w:eastAsia="Times New Roman" w:hAnsi="Times New Roman"/>
+          <w:sz w:val="24"/>
+          <w:szCs w:val="24"/>
+        </w:rPr>
+        <w:t xml:space="preserve">One of the things that struck me while researching this essay is how quickly the data moved. The shift from 40 percent of AI-adopting companies planning to increase investment in 2023 to 92 percent planning to do so in 2025 happened in two years. That is not a gradual cultural shift — that is an industry making a decision. The students sitting in high school classrooms right now will graduate into that decision. Schools have a narrowing window to give them the tools to navigate it.</w:t>
+      </w:r>
+    </w:p>
+    <w:p>
+      <w:pPr>
+        <w:spacing w:after="240" w:line="480"/>
+      </w:pPr>
+      <w:r>
+        <w:rPr>
+          <w:rFonts w:ascii="Times New Roman" w:cs="Times New Roman" w:eastAsia="Times New Roman" w:hAnsi="Times New Roman"/>
+          <w:sz w:val="24"/>
+          <w:szCs w:val="24"/>
+        </w:rPr>
+        <w:t xml:space="preserve">The counterargument, of course, is that schools are not job training programs — that education is about developing the whole person, not just workforce readiness. I think that is fair. But AI literacy is not just a job skill. It is increasingly a civic one. Knowing how to evaluate AI-generated content, understanding where it fails, being able to distinguish between a well-sourced argument and a hallucinated one — these are things every person needs now, regardless of what they do for work. That makes this an education issue, not just an economic one.</w:t>
       </w:r>
     </w:p>
     <w:p>
@@ -267,33 +293,46 @@
           <w:sz w:val="24"/>
           <w:szCs w:val="24"/>
         </w:rPr>
-        <w:t xml:space="preserve">Some schools have responded to the rise of AI by banning its use and deploying AI-detection software. This approach has serious problems rooted in science, not opinion. A 2024 peer-reviewed study published in the International Journal of Educational Technology in Higher Education tested six major AI detectors against 805 samples. The study found that simple manipulation techniques reduced detector accuracy by 17.4 percent — leading its authors to conclude that these tools 'cannot currently be recommended for determining academic integrity violations due to accuracy limitations and the potential for false accusation which undermines inclusive and fair assessment practices' (Perkins et al., 2024). A separate Stanford-backed study found that over half of TOEFL essays written by non-native English speakers were incorrectly flagged as AI-generated by detection tools (Najarro, 2023).</w:t>
-      </w:r>
-    </w:p>
-    <w:p>
-      <w:pPr>
-        <w:spacing w:after="240" w:line="480"/>
-      </w:pPr>
-      <w:r>
-        <w:rPr>
-          <w:rFonts w:ascii="Times New Roman" w:cs="Times New Roman" w:eastAsia="Times New Roman" w:hAnsi="Times New Roman"/>
-          <w:sz w:val="24"/>
-          <w:szCs w:val="24"/>
-        </w:rPr>
-        <w:t xml:space="preserve">Even Rutgers University's own institutional guidance acknowledges these realities. The Rutgers University Libraries AI in Teaching guide (updated January 2026) notes that AI detectors 'can be prone to produce false positives or negatives' and 'tend to be biased against non-native English writers.' Rutgers' official AI guidance from the Office of Information Technology (updated 2025) takes a measured, instructor-driven stance — explicitly noting that 'guidance on the appropriate use of AI tools in academic settings will typically vary depending on the discipline, course, and/or instructor.' This is not a ban. It is an acknowledgment that context matters.</w:t>
-      </w:r>
-    </w:p>
-    <w:p>
-      <w:pPr>
-        <w:spacing w:after="240" w:line="480"/>
-      </w:pPr>
-      <w:r>
-        <w:rPr>
-          <w:rFonts w:ascii="Times New Roman" w:cs="Times New Roman" w:eastAsia="Times New Roman" w:hAnsi="Times New Roman"/>
-          <w:sz w:val="24"/>
-          <w:szCs w:val="24"/>
-        </w:rPr>
-        <w:t xml:space="preserve">As New York Times technology columnist Kevin Roose argued in January 2023, banning ChatGPT simply will not work: students have phones, personal laptops, and VPNs. The more effective approach is AI-integrated pedagogy — explicitly teaching students when, how, and why to use AI tools, and designing assignments that require demonstrated human thought even when AI assistance is permitted. A student who learns to critically evaluate an AI-generated paragraph is practicing exactly the kind of source skepticism that research and writing classes have always aimed to build.</w:t>
+        <w:t xml:space="preserve">Some schools have moved to ban AI use and deploy detection software. I understand why. It is a fast response to a disruptive technology, and academic integrity is a real concern. But the evidence on whether it works is pretty clear: it does not.</w:t>
+      </w:r>
+    </w:p>
+    <w:p>
+      <w:pPr>
+        <w:spacing w:after="240" w:line="480"/>
+      </w:pPr>
+      <w:r>
+        <w:rPr>
+          <w:rFonts w:ascii="Times New Roman" w:cs="Times New Roman" w:eastAsia="Times New Roman" w:hAnsi="Times New Roman"/>
+          <w:sz w:val="24"/>
+          <w:szCs w:val="24"/>
+        </w:rPr>
+        <w:t xml:space="preserve">A 2024 peer-reviewed study in the International Journal of Educational Technology in Higher Education tested six major AI detectors against 805 samples and found that simple manipulation techniques — the kind a student could apply in seconds — reduced detector accuracy by 17.4 percent. The authors concluded these tools 'cannot currently be recommended for determining academic integrity violations' (Perkins et al., 2024). A separate Stanford-backed study found over half of TOEFL essays written by non-native English speakers were falsely flagged as AI-generated, while native-speaker essays passed (Najarro, 2023). So the tools do not reliably catch what they are supposed to catch, and they disproportionately punish the students least likely to have had writing advantages to begin with.</w:t>
+      </w:r>
+    </w:p>
+    <w:p>
+      <w:pPr>
+        <w:spacing w:after="240" w:line="480"/>
+      </w:pPr>
+      <w:r>
+        <w:rPr>
+          <w:rFonts w:ascii="Times New Roman" w:cs="Times New Roman" w:eastAsia="Times New Roman" w:hAnsi="Times New Roman"/>
+          <w:sz w:val="24"/>
+          <w:szCs w:val="24"/>
+        </w:rPr>
+        <w:t xml:space="preserve">Rutgers' own guidance reflects this ambivalence. The university's Library AI in Teaching guide acknowledges that detectors 'can be prone to produce false positives or negatives' and 'tend to be biased against non-native English writers.' The official OIT guidance, updated in 2025, does not ban AI — it leaves policy to instructors and calls for contextual judgment. That is the right instinct. What it lacks is a corresponding push toward actually teaching AI literacy, rather than simply leaving it unaddressed.</w:t>
+      </w:r>
+    </w:p>
+    <w:p>
+      <w:pPr>
+        <w:spacing w:after="240" w:line="480"/>
+      </w:pPr>
+      <w:r>
+        <w:rPr>
+          <w:rFonts w:ascii="Times New Roman" w:cs="Times New Roman" w:eastAsia="Times New Roman" w:hAnsi="Times New Roman"/>
+          <w:sz w:val="24"/>
+          <w:szCs w:val="24"/>
+        </w:rPr>
+        <w:t xml:space="preserve">Kevin Roose made this point simply in the New York Times in January 2023: banning ChatGPT will not work because students have phones, laptops, and VPNs. The choice is not between a world with student AI use and a world without it. The choice is between a world where students use AI thoughtlessly and a world where they have been taught to use it well.</w:t>
       </w:r>
     </w:p>
     <w:p>
@@ -321,7 +360,7 @@
           <w:sz w:val="24"/>
           <w:szCs w:val="24"/>
         </w:rPr>
-        <w:t xml:space="preserve">The question 'should AI be allowed in schools?' is already being answered by students themselves, every day. The better question — the more honest one — is whether schools will be part of teaching students to use it well. In 2023, 40 percent of AI-adopting companies planned to increase their investment. By 2025, that figure had risen to 92 percent. The trajectory of this technology is not uncertain — it is already written in the data. Schools that teach students to navigate AI critically and ethically are not lowering standards. They are raising them to meet the world their students are actually entering.</w:t>
+        <w:t xml:space="preserve">I am not arguing that AI is harmless or that every student will use it responsibly. I am arguing that the response to that reality cannot be to pretend it does not exist. From 2023 to 2026, the share of companies planning to increase AI investment went from 40 percent to 92 percent. That is the world students are heading into. Schools that teach AI literacy — critically, honestly, with attention to its failures as well as its uses — are preparing students for that world. Schools that don't are leaving students to figure it out on their own. They will figure it out. It would just be better if their education had been part of it.</w:t>
       </w:r>
     </w:p>
     <w:p>
@@ -505,59 +544,72 @@
           <w:sz w:val="24"/>
           <w:szCs w:val="24"/>
         </w:rPr>
-        <w:t xml:space="preserve">This project began with a question I genuinely care about as both a student and a developer: should AI be allowed in schools? I chose to argue that it should not merely be permitted, but actively taught — particularly for writing — because I have seen firsthand how AI tools can be either a crutch or a scaffold depending on how you approach them.</w:t>
-      </w:r>
-    </w:p>
-    <w:p>
-      <w:pPr>
-        <w:spacing w:after="240" w:line="480"/>
-      </w:pPr>
-      <w:r>
-        <w:rPr>
-          <w:rFonts w:ascii="Times New Roman" w:cs="Times New Roman" w:eastAsia="Times New Roman" w:hAnsi="Times New Roman"/>
-          <w:sz w:val="24"/>
-          <w:szCs w:val="24"/>
-        </w:rPr>
-        <w:t xml:space="preserve">For my multimodal composition, I utilized three primary modes of communication: Linguistic, Visual, and Spatial. The linguistic mode forms the backbone — the written argument itself, organized around a clear thesis and supported by expert sources including peer-reviewed studies, Gallup and Morgan Stanley workforce data, and Rutgers' own institutional AI guidance. I chose this mode because my central claim is argumentative and required sustained prose reasoning to develop effectively.</w:t>
-      </w:r>
-    </w:p>
-    <w:p>
-      <w:pPr>
-        <w:spacing w:after="240" w:line="480"/>
-      </w:pPr>
-      <w:r>
-        <w:rPr>
-          <w:rFonts w:ascii="Times New Roman" w:cs="Times New Roman" w:eastAsia="Times New Roman" w:hAnsi="Times New Roman"/>
-          <w:sz w:val="24"/>
-          <w:szCs w:val="24"/>
-        </w:rPr>
-        <w:t xml:space="preserve">The visual mode was incorporated through the companion website I created as part of this project. The site uses comparative infographics, a growth-over-time data table showing how AI adoption figures have shifted from 2023 to 2026, visual section headers, and a designed layout to communicate the structure and stakes of the argument at a glance. I chose the visual mode because my audience — other students and educators — is accustomed to processing information digitally, and visual design can communicate tone and urgency in ways that pure text cannot.</w:t>
-      </w:r>
-    </w:p>
-    <w:p>
-      <w:pPr>
-        <w:spacing w:after="240" w:line="480"/>
-      </w:pPr>
-      <w:r>
-        <w:rPr>
-          <w:rFonts w:ascii="Times New Roman" w:cs="Times New Roman" w:eastAsia="Times New Roman" w:hAnsi="Times New Roman"/>
-          <w:sz w:val="24"/>
-          <w:szCs w:val="24"/>
-        </w:rPr>
-        <w:t xml:space="preserve">The spatial mode was expressed through the deliberate layout and navigation of the website — the way sections flow, the hierarchy of information, and the use of whitespace to guide the reader's attention. I wanted the form of the project to reflect its argument: that AI and design tools, used intentionally, produce something more thoughtful than either could alone.</w:t>
-      </w:r>
-    </w:p>
-    <w:p>
-      <w:pPr>
-        <w:spacing w:after="240" w:line="480"/>
-      </w:pPr>
-      <w:r>
-        <w:rPr>
-          <w:rFonts w:ascii="Times New Roman" w:cs="Times New Roman" w:eastAsia="Times New Roman" w:hAnsi="Times New Roman"/>
-          <w:sz w:val="24"/>
-          <w:szCs w:val="24"/>
-        </w:rPr>
-        <w:t xml:space="preserve">The most challenging part of this project was resisting the urge to oversimplify. The question of AI in schools is genuinely complex — there are real risks of dependency, academic dishonesty, and inequitable access. I tried to address these honestly, including by engaging directly with Rutgers' own policy and with peer-reviewed research on AI detector failures. Ultimately, I hope this project demonstrates that the question is not whether AI belongs in education, but how we ensure it belongs there on our terms — and with urgency, because the numbers tell us the window to act is narrowing.</w:t>
+        <w:t xml:space="preserve">I came into this project with a perspective that I did not have to manufacture. As a Computer Engineering student at Rutgers and a co-founder of Tenzor LLC — a software startup I run with a few friends — I use AI tools almost every day. Not as a shortcut, but as part of a real development workflow. At Tenzor, we build client software: our first major project was a point-of-sale and client management system for a gym, built in Next.js and TypeScript with Stripe handling payments. When I was working on components like the checkout flow or the member PIN verification system, I would sometimes use AI to think through an approach or surface an edge case I had not considered. But I was always the one evaluating the output, integrating it into our codebase, and making the call on what shipped. The AI was a tool in the process. I was still the engineer.</w:t>
+      </w:r>
+    </w:p>
+    <w:p>
+      <w:pPr>
+        <w:spacing w:after="240" w:line="480"/>
+      </w:pPr>
+      <w:r>
+        <w:rPr>
+          <w:rFonts w:ascii="Times New Roman" w:cs="Times New Roman" w:eastAsia="Times New Roman" w:hAnsi="Times New Roman"/>
+          <w:sz w:val="24"/>
+          <w:szCs w:val="24"/>
+        </w:rPr>
+        <w:t xml:space="preserve">That experience is what made this topic feel real to me rather than abstract. I know from practice what it looks like to use AI well — and I also know what it looks like when someone just pastes the output and calls it done. Those are completely different things. The first is a skill. The second is not. My argument in this essay is that schools should be teaching the first, because the second is going to happen regardless.</w:t>
+      </w:r>
+    </w:p>
+    <w:p>
+      <w:pPr>
+        <w:spacing w:after="240" w:line="480"/>
+      </w:pPr>
+      <w:r>
+        <w:rPr>
+          <w:rFonts w:ascii="Times New Roman" w:cs="Times New Roman" w:eastAsia="Times New Roman" w:hAnsi="Times New Roman"/>
+          <w:sz w:val="24"/>
+          <w:szCs w:val="24"/>
+        </w:rPr>
+        <w:t xml:space="preserve">For the multimodal elements of this composition, I used three modes: Linguistic, Visual, and Spatial. The written essay is the primary linguistic artifact — I tried to write it in a voice that sounds like mine, including the parts where I complicate my own argument. I did not want it to read like a five-paragraph essay with a thesis bolted on. I wanted it to actually work through the tension.</w:t>
+      </w:r>
+    </w:p>
+    <w:p>
+      <w:pPr>
+        <w:spacing w:after="240" w:line="480"/>
+      </w:pPr>
+      <w:r>
+        <w:rPr>
+          <w:rFonts w:ascii="Times New Roman" w:cs="Times New Roman" w:eastAsia="Times New Roman" w:hAnsi="Times New Roman"/>
+          <w:sz w:val="24"/>
+          <w:szCs w:val="24"/>
+        </w:rPr>
+        <w:t xml:space="preserve">The visual mode is the companion website, which I designed and built as a separate artifact. The site includes the written argument, an interactive comparison of banning versus teaching AI, a data table showing how AI adoption numbers have shifted from 2023 to 2026, and a live works cited section with real hyperlinks to sources. Building the site also gave me a chance to use AI tools in the way I was arguing for — using them to accelerate production of a designed artifact while keeping all the decisions about layout, content, and argument in my own hands.</w:t>
+      </w:r>
+    </w:p>
+    <w:p>
+      <w:pPr>
+        <w:spacing w:after="240" w:line="480"/>
+      </w:pPr>
+      <w:r>
+        <w:rPr>
+          <w:rFonts w:ascii="Times New Roman" w:cs="Times New Roman" w:eastAsia="Times New Roman" w:hAnsi="Times New Roman"/>
+          <w:sz w:val="24"/>
+          <w:szCs w:val="24"/>
+        </w:rPr>
+        <w:t xml:space="preserve">The spatial mode lives in the website's structure: how sections flow into each other, how the data table is positioned to land after the argument has been set up, how the reader is guided from the central question through to the conclusion. Design decisions like that are spatial choices — they shape what the reader understands and when.</w:t>
+      </w:r>
+    </w:p>
+    <w:p>
+      <w:pPr>
+        <w:spacing w:after="240" w:line="480"/>
+      </w:pPr>
+      <w:r>
+        <w:rPr>
+          <w:rFonts w:ascii="Times New Roman" w:cs="Times New Roman" w:eastAsia="Times New Roman" w:hAnsi="Times New Roman"/>
+          <w:sz w:val="24"/>
+          <w:szCs w:val="24"/>
+        </w:rPr>
+        <w:t xml:space="preserve">The hardest part of this project was the section on counterarguments. My instinct was to knock them down quickly and move on. But I think the stronger version of the essay is the one where I actually sit with the concern that AI makes students lazy, acknowledge that it can, and then explain why the answer to that is better teaching rather than prohibition. If I had just dismissed the counterargument, the essay would have been easier to write and less honest. I tried to make it honest.</w:t>
       </w:r>
     </w:p>
     <w:sectPr>

</xml_diff>